<commit_message>
Update docs for active learning-disorder scope
</commit_message>
<xml_diff>
--- a/docs/formatted_documents/docx/ARCHITECTURE.docx
+++ b/docs/formatted_documents/docx/ARCHITECTURE.docx
@@ -74,7 +74,7 @@
     <w:p/>
     <w:p>
       <w:r>
-        <w:t>The project is multimodal and multi-surface. That means one feature may exist in more than one UI, but the backend logic and persistence layer can still be different. When debugging, always identify the active surface first. The documentation frames the system as a learning-disorder platform, with dyslexia as the primary use case.</w:t>
+        <w:t>The project is multimodal and multi-surface. That means one feature may exist in more than one UI, but the backend logic and persistence layer can still be different. When debugging, always identify the active surface first. The documentation frames the system as a learning-disorder platform, with dyslexia as the primary use case. Handwriting/image-based sections are retained for archival comparison only; the active deployed story centers on audio, text, behavior, eye-tracking, and biomarker-driven screening.</w:t>
       </w:r>
     </w:p>
     <w:p/>
@@ -179,7 +179,7 @@
         <w:br/>
         <w:t xml:space="preserve">                    | manifest CSV rows    |</w:t>
         <w:br/>
-        <w:t xml:space="preserve">                    | handwriting images   |</w:t>
+        <w:t xml:space="preserve">                    | archived handwriting |</w:t>
         <w:br/>
         <w:t xml:space="preserve">                    | reading audio files  |</w:t>
         <w:br/>
@@ -221,7 +221,7 @@
         <w:br/>
         <w:t xml:space="preserve">                    |----------------------|</w:t>
         <w:br/>
-        <w:t xml:space="preserve">                    | handwriting encoder  |</w:t>
+        <w:t xml:space="preserve">                    | archived visual enc. |</w:t>
         <w:br/>
         <w:t xml:space="preserve">                    | audio encoder        |</w:t>
         <w:br/>
@@ -1008,6 +1008,12 @@
     <w:p/>
     <w:p>
       <w:r>
+        <w:t>Archived reference only.</w:t>
+      </w:r>
+    </w:p>
+    <w:p/>
+    <w:p>
+      <w:r>
         <w:t>The handwriting encoder is a small CNN stack:</w:t>
       </w:r>
     </w:p>
@@ -1078,7 +1084,7 @@
     <w:p/>
     <w:p>
       <w:r>
-        <w:t>It produces a compact handwriting embedding.</w:t>
+        <w:t>It produces a compact archived handwriting embedding.</w:t>
       </w:r>
     </w:p>
     <w:p/>
@@ -1210,6 +1216,12 @@
     <w:p/>
     <w:p>
       <w:r>
+        <w:t>Archived reference only.</w:t>
+      </w:r>
+    </w:p>
+    <w:p/>
+    <w:p>
+      <w:r>
         <w:t>ViTHandwritingEncoder uses patch embeddings instead of a pure CNN.</w:t>
       </w:r>
     </w:p>
@@ -1500,7 +1512,7 @@
         <w:ind w:left="0"/>
       </w:pPr>
       <w:r>
-        <w:t>InitialCNNModel</w:t>
+        <w:t>InitialCNNModel (archived)</w:t>
       </w:r>
     </w:p>
     <w:p>
@@ -1509,7 +1521,7 @@
         <w:ind w:left="0"/>
       </w:pPr>
       <w:r>
-        <w:t>InitialLSTMModel</w:t>
+        <w:t>InitialLSTMModel (archived)</w:t>
       </w:r>
     </w:p>
     <w:p>
@@ -1518,7 +1530,7 @@
         <w:ind w:left="0"/>
       </w:pPr>
       <w:r>
-        <w:t>InitialCNNLSTMModel</w:t>
+        <w:t>InitialCNNLSTMModel (archived)</w:t>
       </w:r>
     </w:p>
     <w:p/>
@@ -1583,7 +1595,7 @@
         <w:ind w:left="0"/>
       </w:pPr>
       <w:r>
-        <w:t>handwriting CNN</w:t>
+        <w:t>archived handwriting CNN</w:t>
       </w:r>
     </w:p>
     <w:p>
@@ -1661,13 +1673,13 @@
     <w:p/>
     <w:p>
       <w:r>
-        <w:t>ViTMultimodalModel swaps the handwriting CNN for a patch-based vision transformer encoder.</w:t>
+        <w:t>ViTMultimodalModel swaps the archived handwriting CNN for a patch-based vision transformer encoder.</w:t>
       </w:r>
     </w:p>
     <w:p/>
     <w:p>
       <w:r>
-        <w:t>Use this when you want patch-aware handwriting representation.</w:t>
+        <w:t>Use this when you want patch-aware archived image representation.</w:t>
       </w:r>
     </w:p>
     <w:p/>
@@ -1682,7 +1694,7 @@
     <w:p/>
     <w:p>
       <w:r>
-        <w:t>ViTTransformerMultimodalModel uses transformer encoders for both handwriting and text.</w:t>
+        <w:t>ViTTransformerMultimodalModel uses transformer encoders for both archived visual input and text.</w:t>
       </w:r>
     </w:p>
     <w:p/>
@@ -1981,7 +1993,7 @@
         <w:ind w:left="0"/>
       </w:pPr>
       <w:r>
-        <w:t>encode handwriting, audio, text, and behavior</w:t>
+        <w:t>encode audio, text, behavior, and any archived visual input</w:t>
       </w:r>
     </w:p>
     <w:p>
@@ -2259,7 +2271,7 @@
         <w:ind w:left="0"/>
       </w:pPr>
       <w:r>
-        <w:t>visualizing what parts of a handwriting image influenced the prediction</w:t>
+        <w:t>visualizing what parts of an archived image influenced the prediction</w:t>
       </w:r>
     </w:p>
     <w:p/>
@@ -2284,7 +2296,7 @@
         <w:ind w:left="0"/>
       </w:pPr>
       <w:r>
-        <w:t>patch importance visualization for ViT handwriting models</w:t>
+        <w:t>patch importance visualization for ViT image models</w:t>
       </w:r>
     </w:p>
     <w:p/>
@@ -2624,7 +2636,7 @@
         <w:ind w:left="0"/>
       </w:pPr>
       <w:r>
-        <w:t>handwriting biomarkers</w:t>
+        <w:t>archived handwriting biomarkers</w:t>
       </w:r>
     </w:p>
     <w:p>

</xml_diff>